<commit_message>
add your turn solution and live coding
</commit_message>
<xml_diff>
--- a/Exercise-02-Solution.docx
+++ b/Exercise-02-Solution.docx
@@ -991,15 +991,7 @@
         <w:pStyle w:val="FirstParagraph"/>
       </w:pPr>
       <w:r>
-        <w:t xml:space="preserve">Customers in the South who purchased the most in December 2018 appear to be</w:t>
-      </w:r>
-    </w:p>
-    <w:p>
-      <w:pPr>
-        <w:pStyle w:val="BodyText"/>
-      </w:pPr>
-      <w:r>
-        <w:t xml:space="preserve">mostly married with college degrees.</w:t>
+        <w:t xml:space="preserve">Customers in the South who purchased the most in December 2018 appear to be mostly married with college degrees.</w:t>
       </w:r>
     </w:p>
     <w:bookmarkEnd w:id="20"/>

</xml_diff>